<commit_message>
Fix ЛР2-3: real top-down via GDP, correct scenario arithmetic, TAM/SAM/SOM
Council audit found top-down and bottom-up used the same formula twice,
and 2 of 3 scenario figures didn't reconcile with their own stated
assumptions (Осторожный $15K claimed vs $9.6K actual; Оптимистичный
$150K+ claimed vs $336K actual). Fixed: real top-down from Belarus GDP
($78.59B, 2024) x IT-sector share, corrected scenario math, added
explicit TAM/SAM/SOM framing tying the three numbers together.
</commit_message>
<xml_diff>
--- a/labs/lab2-3-market-size/ЛР2-3_Объём_рынка_DiagramCode.docx
+++ b/labs/lab2-3-market-size/ЛР2-3_Объём_рынка_DiagramCode.docx
@@ -816,286 +816,22 @@
         <w:spacing w:after="120" w:before="240"/>
       </w:pPr>
       <w:r>
-        <w:t xml:space="preserve">5. Расчёт «сверху вниз» (top-down)</w:t>
-      </w:r>
-    </w:p>
-    <w:p>
-      <w:pPr>
-        <w:spacing w:after="20"/>
-      </w:pPr>
-      <w:r>
-        <w:rPr>
-          <w:rFonts w:ascii="Consolas" w:cs="Consolas" w:eastAsia="Consolas" w:hAnsi="Consolas"/>
-          <w:sz w:val="20"/>
-          <w:szCs w:val="20"/>
-        </w:rPr>
-        <w:t xml:space="preserve">Объём рынка = ПВТ-компании × доля с трафиком/интересом к diagram-as-code × доля готовых платить × средний чек/год</w:t>
-      </w:r>
-    </w:p>
-    <w:p>
-      <w:pPr>
-        <w:spacing w:after="20"/>
-      </w:pPr>
-      <w:r>
-        <w:rPr>
-          <w:rFonts w:ascii="Consolas" w:cs="Consolas" w:eastAsia="Consolas" w:hAnsi="Consolas"/>
-          <w:sz w:val="20"/>
-          <w:szCs w:val="20"/>
-        </w:rPr>
-        <w:t xml:space="preserve">            = 1000 × 0,30 (допущение: доля компаний, чьи команды уже искали/использовали diagram-as-code инструменты,</w:t>
-      </w:r>
-    </w:p>
-    <w:p>
-      <w:pPr>
-        <w:spacing w:after="20"/>
-      </w:pPr>
-      <w:r>
-        <w:rPr>
-          <w:rFonts w:ascii="Consolas" w:cs="Consolas" w:eastAsia="Consolas" w:hAnsi="Consolas"/>
-          <w:sz w:val="20"/>
-          <w:szCs w:val="20"/>
-        </w:rPr>
-        <w:t xml:space="preserve">                            ориентир — доля России в трафике plantuml.com среди стран-лидеров ~9%, для Беларуси как</w:t>
-      </w:r>
-    </w:p>
-    <w:p>
-      <w:pPr>
-        <w:spacing w:after="20"/>
-      </w:pPr>
-      <w:r>
-        <w:rPr>
-          <w:rFonts w:ascii="Consolas" w:cs="Consolas" w:eastAsia="Consolas" w:hAnsi="Consolas"/>
-          <w:sz w:val="20"/>
-          <w:szCs w:val="20"/>
-        </w:rPr>
-        <w:t xml:space="preserve">                            более узкого IT-хаба берём выше — 30%, допущение на проверку)</w:t>
-      </w:r>
-    </w:p>
-    <w:p>
-      <w:pPr>
-        <w:spacing w:after="20"/>
-      </w:pPr>
-      <w:r>
-        <w:rPr>
-          <w:rFonts w:ascii="Consolas" w:cs="Consolas" w:eastAsia="Consolas" w:hAnsi="Consolas"/>
-          <w:sz w:val="20"/>
-          <w:szCs w:val="20"/>
-        </w:rPr>
-        <w:t xml:space="preserve">            × 0,15 (доля готовых платить за AI-надстройку, а не остаться на бесплatном PlantUML/Mermaid — допущение)</w:t>
-      </w:r>
-    </w:p>
-    <w:p>
-      <w:pPr>
-        <w:spacing w:after="20"/>
-      </w:pPr>
-      <w:r>
-        <w:rPr>
-          <w:rFonts w:ascii="Consolas" w:cs="Consolas" w:eastAsia="Consolas" w:hAnsi="Consolas"/>
-          <w:sz w:val="20"/>
-          <w:szCs w:val="20"/>
-        </w:rPr>
-        <w:t xml:space="preserve">            × $480/год</w:t>
-      </w:r>
-    </w:p>
-    <w:p>
-      <w:pPr>
-        <w:spacing w:after="20"/>
-      </w:pPr>
-      <w:r>
-        <w:rPr>
-          <w:rFonts w:ascii="Consolas" w:cs="Consolas" w:eastAsia="Consolas" w:hAnsi="Consolas"/>
-          <w:sz w:val="20"/>
-          <w:szCs w:val="20"/>
-        </w:rPr>
-        <w:t xml:space="preserve">            = 1000 × 0,30 × 0,15 × 480 ≈ $21 600/год (верхняя ориентировочная оценка для сегмента ПВТ Беларуси)</w:t>
-      </w:r>
-    </w:p>
-    <w:p>
-      <w:pPr>
-        <w:spacing w:after="100"/>
-      </w:pPr>
-    </w:p>
-    <w:p>
-      <w:pPr>
-        <w:pStyle w:val="Heading1"/>
-        <w:spacing w:after="120" w:before="240"/>
-      </w:pPr>
-      <w:r>
-        <w:t xml:space="preserve">6. Расчёт «снизу вверх» (bottom-up) — через количество потенциальных клиентов</w:t>
-      </w:r>
-    </w:p>
-    <w:p>
-      <w:pPr>
-        <w:spacing w:after="20"/>
-      </w:pPr>
-      <w:r>
-        <w:rPr>
-          <w:rFonts w:ascii="Consolas" w:cs="Consolas" w:eastAsia="Consolas" w:hAnsi="Consolas"/>
-          <w:sz w:val="20"/>
-          <w:szCs w:val="20"/>
-        </w:rPr>
-        <w:t xml:space="preserve">Платежеспособный рынок = число компаний в сегменте × доля нуждающихся × доля готовых покупать онлайн × средний годовой чек</w:t>
-      </w:r>
-    </w:p>
-    <w:p>
-      <w:pPr>
-        <w:spacing w:after="20"/>
-      </w:pPr>
-      <w:r>
-        <w:rPr>
-          <w:rFonts w:ascii="Consolas" w:cs="Consolas" w:eastAsia="Consolas" w:hAnsi="Consolas"/>
-          <w:sz w:val="20"/>
-          <w:szCs w:val="20"/>
-        </w:rPr>
-        <w:t xml:space="preserve">                        = 1000 × 0,60 (допущение: доля компаний, ведущих техдокументацию с диаграммами)</w:t>
-      </w:r>
-    </w:p>
-    <w:p>
-      <w:pPr>
-        <w:spacing w:after="20"/>
-      </w:pPr>
-      <w:r>
-        <w:rPr>
-          <w:rFonts w:ascii="Consolas" w:cs="Consolas" w:eastAsia="Consolas" w:hAnsi="Consolas"/>
-          <w:sz w:val="20"/>
-          <w:szCs w:val="20"/>
-        </w:rPr>
-        <w:t xml:space="preserve">                          × 0,10 (доля готовых платить именно за AI-инструмент, а не бесплатную альтернативу)</w:t>
-      </w:r>
-    </w:p>
-    <w:p>
-      <w:pPr>
-        <w:spacing w:after="20"/>
-      </w:pPr>
-      <w:r>
-        <w:rPr>
-          <w:rFonts w:ascii="Consolas" w:cs="Consolas" w:eastAsia="Consolas" w:hAnsi="Consolas"/>
-          <w:sz w:val="20"/>
-          <w:szCs w:val="20"/>
-        </w:rPr>
-        <w:t xml:space="preserve">                          × $480</w:t>
-      </w:r>
-    </w:p>
-    <w:p>
-      <w:pPr>
-        <w:spacing w:after="20"/>
-      </w:pPr>
-      <w:r>
-        <w:rPr>
-          <w:rFonts w:ascii="Consolas" w:cs="Consolas" w:eastAsia="Consolas" w:hAnsi="Consolas"/>
-          <w:sz w:val="20"/>
-          <w:szCs w:val="20"/>
-        </w:rPr>
-        <w:t xml:space="preserve">                        = 1000 × 0,60 × 0,10 × 480 = $28 800/год</w:t>
-      </w:r>
-    </w:p>
-    <w:p>
-      <w:pPr>
-        <w:spacing w:after="100"/>
-      </w:pPr>
+        <w:t xml:space="preserve">5. Расчёт «сверху вниз» (top-down) — независимый от раздела 6, через ВВП</w:t>
+      </w:r>
     </w:p>
     <w:p>
       <w:pPr>
         <w:spacing w:after="120"/>
       </w:pPr>
       <w:r>
-        <w:t xml:space="preserve">Оба метода («сверху вниз» и «снизу вверх») дают близкий порядок величины ($21,6К - $28,8К/год для стартового сегмента ПВТ Беларуси) — это хороший признак согласованности расчёта по правилам методики (раздел 11 инструкции ЛР2: «если методики сильно расходятся — проверить коэффициенты сужения»).</w:t>
-      </w:r>
-    </w:p>
-    <w:p>
-      <w:pPr>
-        <w:pStyle w:val="Heading1"/>
-        <w:spacing w:after="120" w:before="240"/>
-      </w:pPr>
-      <w:r>
-        <w:t xml:space="preserve">7. Оценка через цифровую воронку</w:t>
-      </w:r>
-    </w:p>
-    <w:p>
-      <w:pPr>
-        <w:spacing w:after="20"/>
-      </w:pPr>
-      <w:r>
-        <w:rPr>
-          <w:rFonts w:ascii="Consolas" w:cs="Consolas" w:eastAsia="Consolas" w:hAnsi="Consolas"/>
-          <w:sz w:val="20"/>
-          <w:szCs w:val="20"/>
-        </w:rPr>
-        <w:t xml:space="preserve">Выручка = охват (посетители блога/документации DiagramCode + органический поиск по семантическому ядру ЛР1)</w:t>
-      </w:r>
-    </w:p>
-    <w:p>
-      <w:pPr>
-        <w:spacing w:after="20"/>
-      </w:pPr>
-      <w:r>
-        <w:rPr>
-          <w:rFonts w:ascii="Consolas" w:cs="Consolas" w:eastAsia="Consolas" w:hAnsi="Consolas"/>
-          <w:sz w:val="20"/>
-          <w:szCs w:val="20"/>
-        </w:rPr>
-        <w:t xml:space="preserve">        × доля переходов на сайт (допущение 20%)</w:t>
-      </w:r>
-    </w:p>
-    <w:p>
-      <w:pPr>
-        <w:spacing w:after="20"/>
-      </w:pPr>
-      <w:r>
-        <w:rPr>
-          <w:rFonts w:ascii="Consolas" w:cs="Consolas" w:eastAsia="Consolas" w:hAnsi="Consolas"/>
-          <w:sz w:val="20"/>
-          <w:szCs w:val="20"/>
-        </w:rPr>
-        <w:t xml:space="preserve">        × конверсия в регистрацию (допущение 8%, ориентир по индустрии для dev-tools)</w:t>
-      </w:r>
-    </w:p>
-    <w:p>
-      <w:pPr>
-        <w:spacing w:after="20"/>
-      </w:pPr>
-      <w:r>
-        <w:rPr>
-          <w:rFonts w:ascii="Consolas" w:cs="Consolas" w:eastAsia="Consolas" w:hAnsi="Consolas"/>
-          <w:sz w:val="20"/>
-          <w:szCs w:val="20"/>
-        </w:rPr>
-        <w:t xml:space="preserve">        × конверсия в оплату (допущение 5%, консервативно из-за сильных бесплатных альтернатив — PlantUML/Mermaid бесплатны)</w:t>
-      </w:r>
-    </w:p>
-    <w:p>
-      <w:pPr>
-        <w:spacing w:after="20"/>
-      </w:pPr>
-      <w:r>
-        <w:rPr>
-          <w:rFonts w:ascii="Consolas" w:cs="Consolas" w:eastAsia="Consolas" w:hAnsi="Consolas"/>
-          <w:sz w:val="20"/>
-          <w:szCs w:val="20"/>
-        </w:rPr>
-        <w:t xml:space="preserve">        × средний чек $480/год</w:t>
-      </w:r>
-    </w:p>
-    <w:p>
-      <w:pPr>
-        <w:spacing w:after="100"/>
-      </w:pPr>
-    </w:p>
-    <w:p>
-      <w:pPr>
-        <w:spacing w:after="120"/>
-      </w:pPr>
-      <w:r>
-        <w:t xml:space="preserve">Без готового трафика сайта DiagramCode (продукт ещё не запущен) этот расчёт пока не даёт числа — он используется после первого релиза как инструмент проверки факта, а не прогноза (см. общий принцип методики: воронка — расчёт по фактическим данным, а не по гипотетическому трафику).</w:t>
-      </w:r>
-    </w:p>
-    <w:p>
-      <w:pPr>
-        <w:pStyle w:val="Heading1"/>
-        <w:spacing w:after="120" w:before="240"/>
-      </w:pPr>
-      <w:r>
-        <w:t xml:space="preserve">8. Сценарная оценка</w:t>
+        <w:rPr>
+          <w:b/>
+          <w:bCs/>
+        </w:rPr>
+        <w:t xml:space="preserve">Исправление после ревизии</w:t>
+      </w:r>
+      <w:r>
+        <w:t xml:space="preserve">: в предыдущей версии этого документа разделы 5 и 6 по ошибке использовали одну и ту же формулу (через количество компаний) с разными коэффициентами — это не два независимых метода, а один и тот же, посчитанный дважды. Настоящий «сверху вниз» обязан стартовать от внешнего агрегата (методика ЛР2, §7.1: «начинается с большого показателя»), поэтому ниже — пересчёт от ВВП Беларуси, а раздел 6 остаётся единственным расчётом через количество клиентов.</w:t>
       </w:r>
     </w:p>
     <w:tbl>
@@ -1130,13 +866,692 @@
                 <w:b/>
                 <w:bCs/>
               </w:rPr>
+              <w:t xml:space="preserve">Параметр</w:t>
+            </w:r>
+          </w:p>
+        </w:tc>
+        <w:tc>
+          <w:tcPr>
+            <w:tcW w:type="dxa" w:w="3212"/>
+            <w:shd w:fill="D9D9D9" w:val="clear"/>
+          </w:tcPr>
+          <w:p>
+            <w:r>
+              <w:rPr>
+                <w:b/>
+                <w:bCs/>
+              </w:rPr>
+              <w:t xml:space="preserve">Значение</w:t>
+            </w:r>
+          </w:p>
+        </w:tc>
+        <w:tc>
+          <w:tcPr>
+            <w:tcW w:type="dxa" w:w="3212"/>
+            <w:shd w:fill="D9D9D9" w:val="clear"/>
+          </w:tcPr>
+          <w:p>
+            <w:r>
+              <w:rPr>
+                <w:b/>
+                <w:bCs/>
+              </w:rPr>
+              <w:t xml:space="preserve">Источник</w:t>
+            </w:r>
+          </w:p>
+        </w:tc>
+      </w:tr>
+      <w:tr>
+        <w:tc>
+          <w:tcPr>
+            <w:tcW w:type="dxa" w:w="3212"/>
+          </w:tcPr>
+          <w:p>
+            <w:r>
+              <w:t xml:space="preserve">ВВП Беларуси, 2024</w:t>
+            </w:r>
+          </w:p>
+        </w:tc>
+        <w:tc>
+          <w:tcPr>
+            <w:tcW w:type="dxa" w:w="3212"/>
+          </w:tcPr>
+          <w:p>
+            <w:r>
+              <w:rPr>
+                <w:b/>
+                <w:bCs/>
+              </w:rPr>
+              <w:t xml:space="preserve">$78,59 млрд</w:t>
+            </w:r>
+          </w:p>
+        </w:tc>
+        <w:tc>
+          <w:tcPr>
+            <w:tcW w:type="dxa" w:w="3212"/>
+          </w:tcPr>
+          <w:p>
+            <w:r>
+              <w:t xml:space="preserve">macrotrends.net, снято 2026-09-17</w:t>
+            </w:r>
+          </w:p>
+        </w:tc>
+      </w:tr>
+      <w:tr>
+        <w:tc>
+          <w:tcPr>
+            <w:tcW w:type="dxa" w:w="3212"/>
+          </w:tcPr>
+          <w:p>
+            <w:r>
+              <w:t xml:space="preserve">Доля ИТ-сектора в ВВП</w:t>
+            </w:r>
+          </w:p>
+        </w:tc>
+        <w:tc>
+          <w:tcPr>
+            <w:tcW w:type="dxa" w:w="3212"/>
+          </w:tcPr>
+          <w:p>
+            <w:r>
+              <w:t xml:space="preserve">6,1 % (I кв. 2025)</w:t>
+            </w:r>
+          </w:p>
+        </w:tc>
+        <w:tc>
+          <w:tcPr>
+            <w:tcW w:type="dxa" w:w="3212"/>
+          </w:tcPr>
+          <w:p>
+            <w:r>
+              <w:t xml:space="preserve">opencompanyinbelarus.com (уже использован в разделе 3)</w:t>
+            </w:r>
+          </w:p>
+        </w:tc>
+      </w:tr>
+      <w:tr>
+        <w:tc>
+          <w:tcPr>
+            <w:tcW w:type="dxa" w:w="3212"/>
+          </w:tcPr>
+          <w:p>
+            <w:r>
+              <w:t xml:space="preserve">⇒ Оборот ИТ-сектора Беларуси</w:t>
+            </w:r>
+          </w:p>
+        </w:tc>
+        <w:tc>
+          <w:tcPr>
+            <w:tcW w:type="dxa" w:w="3212"/>
+          </w:tcPr>
+          <w:p>
+            <w:r>
+              <w:t xml:space="preserve">$78,59 млрд × 0,061 ≈ </w:t>
+            </w:r>
+            <w:r>
+              <w:rPr>
+                <w:b/>
+                <w:bCs/>
+              </w:rPr>
+              <w:t xml:space="preserve">$4,79 млрд/год</w:t>
+            </w:r>
+          </w:p>
+        </w:tc>
+        <w:tc>
+          <w:tcPr>
+            <w:tcW w:type="dxa" w:w="3212"/>
+          </w:tcPr>
+          <w:p>
+            <w:r>
+              <w:t xml:space="preserve">расчёт</w:t>
+            </w:r>
+          </w:p>
+        </w:tc>
+      </w:tr>
+    </w:tbl>
+    <w:p>
+      <w:pPr>
+        <w:spacing w:after="120"/>
+      </w:pPr>
+    </w:p>
+    <w:p>
+      <w:pPr>
+        <w:spacing w:after="20"/>
+      </w:pPr>
+      <w:r>
+        <w:rPr>
+          <w:rFonts w:ascii="Consolas" w:cs="Consolas" w:eastAsia="Consolas" w:hAnsi="Consolas"/>
+          <w:sz w:val="20"/>
+          <w:szCs w:val="20"/>
+        </w:rPr>
+        <w:t xml:space="preserve">Потолок рынка (TAM) = Оборот ИТ-сектора Беларуси</w:t>
+      </w:r>
+    </w:p>
+    <w:p>
+      <w:pPr>
+        <w:spacing w:after="20"/>
+      </w:pPr>
+      <w:r>
+        <w:rPr>
+          <w:rFonts w:ascii="Consolas" w:cs="Consolas" w:eastAsia="Consolas" w:hAnsi="Consolas"/>
+          <w:sz w:val="20"/>
+          <w:szCs w:val="20"/>
+        </w:rPr>
+        <w:t xml:space="preserve">                     × 0,02 (допущение: доля оборота ИТ-сектора, приходящаяся на внутренний dev-tooling/</w:t>
+      </w:r>
+    </w:p>
+    <w:p>
+      <w:pPr>
+        <w:spacing w:after="20"/>
+      </w:pPr>
+      <w:r>
+        <w:rPr>
+          <w:rFonts w:ascii="Consolas" w:cs="Consolas" w:eastAsia="Consolas" w:hAnsi="Consolas"/>
+          <w:sz w:val="20"/>
+          <w:szCs w:val="20"/>
+        </w:rPr>
+        <w:t xml:space="preserve">                             документацию, а не на клиентские заказные разработки — требует проверки)</w:t>
+      </w:r>
+    </w:p>
+    <w:p>
+      <w:pPr>
+        <w:spacing w:after="20"/>
+      </w:pPr>
+      <w:r>
+        <w:rPr>
+          <w:rFonts w:ascii="Consolas" w:cs="Consolas" w:eastAsia="Consolas" w:hAnsi="Consolas"/>
+          <w:sz w:val="20"/>
+          <w:szCs w:val="20"/>
+        </w:rPr>
+        <w:t xml:space="preserve">                     × 0,05 (допущение: доля dev-tooling-бюджета именно на инструменты диаграмм/документация-как-код)</w:t>
+      </w:r>
+    </w:p>
+    <w:p>
+      <w:pPr>
+        <w:spacing w:after="20"/>
+      </w:pPr>
+      <w:r>
+        <w:rPr>
+          <w:rFonts w:ascii="Consolas" w:cs="Consolas" w:eastAsia="Consolas" w:hAnsi="Consolas"/>
+          <w:sz w:val="20"/>
+          <w:szCs w:val="20"/>
+        </w:rPr>
+        <w:t xml:space="preserve">                     × 0,10 (допущение: реалистично достижимая в 1-й год доля через цифровые каналы и конверсию)</w:t>
+      </w:r>
+    </w:p>
+    <w:p>
+      <w:pPr>
+        <w:spacing w:after="20"/>
+      </w:pPr>
+      <w:r>
+        <w:rPr>
+          <w:rFonts w:ascii="Consolas" w:cs="Consolas" w:eastAsia="Consolas" w:hAnsi="Consolas"/>
+          <w:sz w:val="20"/>
+          <w:szCs w:val="20"/>
+        </w:rPr>
+        <w:t xml:space="preserve">                     = $4 790 000 000 × 0,02 × 0,05 × 0,10</w:t>
+      </w:r>
+    </w:p>
+    <w:p>
+      <w:pPr>
+        <w:spacing w:after="20"/>
+      </w:pPr>
+      <w:r>
+        <w:rPr>
+          <w:rFonts w:ascii="Consolas" w:cs="Consolas" w:eastAsia="Consolas" w:hAnsi="Consolas"/>
+          <w:sz w:val="20"/>
+          <w:szCs w:val="20"/>
+        </w:rPr>
+        <w:t xml:space="preserve">                     = $479 000/год</w:t>
+      </w:r>
+    </w:p>
+    <w:p>
+      <w:pPr>
+        <w:spacing w:after="100"/>
+      </w:pPr>
+    </w:p>
+    <w:p>
+      <w:pPr>
+        <w:spacing w:after="120"/>
+      </w:pPr>
+      <w:r>
+        <w:t xml:space="preserve">Это верхний потолок (TAM), а не прогноз продаж — расчёт от агрегата почти всегда завышает (методика ЛР2, §7.1 «плюсы/ограничения» top-down), что и произошло: $479 000 на порядок больше, чем оценка через клиентов в разделе 6. Это ожидаемо и не является ошибкой — правило согласования №1 (инструкция ЛР2, §11) требует в такой ситуации перепроверить коэффициенты сужения, а не подгонять числа друг под друга; три допущения выше — самое узкое место всего расчёта и явно помечены как требующие проверки.</w:t>
+      </w:r>
+    </w:p>
+    <w:p>
+      <w:pPr>
+        <w:pStyle w:val="Heading1"/>
+        <w:spacing w:after="120" w:before="240"/>
+      </w:pPr>
+      <w:r>
+        <w:t xml:space="preserve">6. Расчёт «снизу вверх» (bottom-up) — через количество потенциальных клиентов</w:t>
+      </w:r>
+    </w:p>
+    <w:p>
+      <w:pPr>
+        <w:spacing w:after="20"/>
+      </w:pPr>
+      <w:r>
+        <w:rPr>
+          <w:rFonts w:ascii="Consolas" w:cs="Consolas" w:eastAsia="Consolas" w:hAnsi="Consolas"/>
+          <w:sz w:val="20"/>
+          <w:szCs w:val="20"/>
+        </w:rPr>
+        <w:t xml:space="preserve">Платежеспособный рынок = число компаний в сегменте × доля нуждающихся × доля готовых покупать онлайн × средний годовой чек</w:t>
+      </w:r>
+    </w:p>
+    <w:p>
+      <w:pPr>
+        <w:spacing w:after="20"/>
+      </w:pPr>
+      <w:r>
+        <w:rPr>
+          <w:rFonts w:ascii="Consolas" w:cs="Consolas" w:eastAsia="Consolas" w:hAnsi="Consolas"/>
+          <w:sz w:val="20"/>
+          <w:szCs w:val="20"/>
+        </w:rPr>
+        <w:t xml:space="preserve">                        = 1000 × 0,60 (допущение: доля компаний, ведущих техдокументацию с диаграммами)</w:t>
+      </w:r>
+    </w:p>
+    <w:p>
+      <w:pPr>
+        <w:spacing w:after="20"/>
+      </w:pPr>
+      <w:r>
+        <w:rPr>
+          <w:rFonts w:ascii="Consolas" w:cs="Consolas" w:eastAsia="Consolas" w:hAnsi="Consolas"/>
+          <w:sz w:val="20"/>
+          <w:szCs w:val="20"/>
+        </w:rPr>
+        <w:t xml:space="preserve">                          × 0,10 (допущение: доля готовых платить именно за AI-инструмент, а не бесплатную альтернативу)</w:t>
+      </w:r>
+    </w:p>
+    <w:p>
+      <w:pPr>
+        <w:spacing w:after="20"/>
+      </w:pPr>
+      <w:r>
+        <w:rPr>
+          <w:rFonts w:ascii="Consolas" w:cs="Consolas" w:eastAsia="Consolas" w:hAnsi="Consolas"/>
+          <w:sz w:val="20"/>
+          <w:szCs w:val="20"/>
+        </w:rPr>
+        <w:t xml:space="preserve">                          × $480</w:t>
+      </w:r>
+    </w:p>
+    <w:p>
+      <w:pPr>
+        <w:spacing w:after="20"/>
+      </w:pPr>
+      <w:r>
+        <w:rPr>
+          <w:rFonts w:ascii="Consolas" w:cs="Consolas" w:eastAsia="Consolas" w:hAnsi="Consolas"/>
+          <w:sz w:val="20"/>
+          <w:szCs w:val="20"/>
+        </w:rPr>
+        <w:t xml:space="preserve">                        = 1000 × 0,60 × 0,10 × 480 = $28 800/год</w:t>
+      </w:r>
+    </w:p>
+    <w:p>
+      <w:pPr>
+        <w:spacing w:after="100"/>
+      </w:pPr>
+    </w:p>
+    <w:p>
+      <w:pPr>
+        <w:pStyle w:val="Heading1"/>
+        <w:spacing w:after="120" w:before="240"/>
+      </w:pPr>
+      <w:r>
+        <w:t xml:space="preserve">6а. TAM / SAM / SOM</w:t>
+      </w:r>
+    </w:p>
+    <w:tbl>
+      <w:tblPr>
+        <w:tblW w:type="dxa" w:w="9638"/>
+        <w:tblBorders>
+          <w:top w:val="single" w:color="auto" w:sz="4"/>
+          <w:left w:val="single" w:color="auto" w:sz="4"/>
+          <w:bottom w:val="single" w:color="auto" w:sz="4"/>
+          <w:right w:val="single" w:color="auto" w:sz="4"/>
+          <w:insideH w:val="single" w:color="auto" w:sz="4"/>
+          <w:insideV w:val="single" w:color="auto" w:sz="4"/>
+        </w:tblBorders>
+      </w:tblPr>
+      <w:tblGrid>
+        <w:gridCol w:w="3212"/>
+        <w:gridCol w:w="3212"/>
+        <w:gridCol w:w="3212"/>
+      </w:tblGrid>
+      <w:tr>
+        <w:trPr>
+          <w:tblHeader/>
+        </w:trPr>
+        <w:tc>
+          <w:tcPr>
+            <w:tcW w:type="dxa" w:w="3212"/>
+            <w:shd w:fill="D9D9D9" w:val="clear"/>
+          </w:tcPr>
+          <w:p>
+            <w:r>
+              <w:rPr>
+                <w:b/>
+                <w:bCs/>
+              </w:rPr>
+              <w:t xml:space="preserve">Уровень</w:t>
+            </w:r>
+          </w:p>
+        </w:tc>
+        <w:tc>
+          <w:tcPr>
+            <w:tcW w:type="dxa" w:w="3212"/>
+            <w:shd w:fill="D9D9D9" w:val="clear"/>
+          </w:tcPr>
+          <w:p>
+            <w:r>
+              <w:rPr>
+                <w:b/>
+                <w:bCs/>
+              </w:rPr>
+              <w:t xml:space="preserve">Значение</w:t>
+            </w:r>
+          </w:p>
+        </w:tc>
+        <w:tc>
+          <w:tcPr>
+            <w:tcW w:type="dxa" w:w="3212"/>
+            <w:shd w:fill="D9D9D9" w:val="clear"/>
+          </w:tcPr>
+          <w:p>
+            <w:r>
+              <w:rPr>
+                <w:b/>
+                <w:bCs/>
+              </w:rPr>
+              <w:t xml:space="preserve">Как получено</w:t>
+            </w:r>
+          </w:p>
+        </w:tc>
+      </w:tr>
+      <w:tr>
+        <w:tc>
+          <w:tcPr>
+            <w:tcW w:type="dxa" w:w="3212"/>
+          </w:tcPr>
+          <w:p>
+            <w:r>
+              <w:rPr>
+                <w:b/>
+                <w:bCs/>
+              </w:rPr>
+              <w:t xml:space="preserve">TAM</w:t>
+            </w:r>
+            <w:r>
+              <w:t xml:space="preserve"> (потолок рынка)</w:t>
+            </w:r>
+          </w:p>
+        </w:tc>
+        <w:tc>
+          <w:tcPr>
+            <w:tcW w:type="dxa" w:w="3212"/>
+          </w:tcPr>
+          <w:p>
+            <w:r>
+              <w:rPr>
+                <w:b/>
+                <w:bCs/>
+              </w:rPr>
+              <w:t xml:space="preserve">≈ $479 000/год</w:t>
+            </w:r>
+          </w:p>
+        </w:tc>
+        <w:tc>
+          <w:tcPr>
+            <w:tcW w:type="dxa" w:w="3212"/>
+          </w:tcPr>
+          <w:p>
+            <w:r>
+              <w:t xml:space="preserve">Раздел 5, расчёт от ВВП/оборота ИТ-сектора Беларуси — максимум при благоприятных допущениях</w:t>
+            </w:r>
+          </w:p>
+        </w:tc>
+      </w:tr>
+      <w:tr>
+        <w:tc>
+          <w:tcPr>
+            <w:tcW w:type="dxa" w:w="3212"/>
+          </w:tcPr>
+          <w:p>
+            <w:r>
+              <w:rPr>
+                <w:b/>
+                <w:bCs/>
+              </w:rPr>
+              <w:t xml:space="preserve">SAM</w:t>
+            </w:r>
+            <w:r>
+              <w:t xml:space="preserve"> (обслуживаемый рынок)</w:t>
+            </w:r>
+          </w:p>
+        </w:tc>
+        <w:tc>
+          <w:tcPr>
+            <w:tcW w:type="dxa" w:w="3212"/>
+          </w:tcPr>
+          <w:p>
+            <w:r>
+              <w:rPr>
+                <w:b/>
+                <w:bCs/>
+              </w:rPr>
+              <w:t xml:space="preserve">≈ $21 600–28 800/год</w:t>
+            </w:r>
+          </w:p>
+        </w:tc>
+        <w:tc>
+          <w:tcPr>
+            <w:tcW w:type="dxa" w:w="3212"/>
+          </w:tcPr>
+          <w:p>
+            <w:r>
+              <w:t xml:space="preserve">Раздел 6 (снизу вверх) — компании ПВТ, реально нуждающиеся и готовые покупать онлайн</w:t>
+            </w:r>
+          </w:p>
+        </w:tc>
+      </w:tr>
+      <w:tr>
+        <w:tc>
+          <w:tcPr>
+            <w:tcW w:type="dxa" w:w="3212"/>
+          </w:tcPr>
+          <w:p>
+            <w:r>
+              <w:rPr>
+                <w:b/>
+                <w:bCs/>
+              </w:rPr>
+              <w:t xml:space="preserve">SOM</w:t>
+            </w:r>
+            <w:r>
+              <w:t xml:space="preserve"> (достижимая доля в 1-й год)</w:t>
+            </w:r>
+          </w:p>
+        </w:tc>
+        <w:tc>
+          <w:tcPr>
+            <w:tcW w:type="dxa" w:w="3212"/>
+          </w:tcPr>
+          <w:p>
+            <w:r>
+              <w:rPr>
+                <w:b/>
+                <w:bCs/>
+              </w:rPr>
+              <w:t xml:space="preserve">≈ $9 600–15 000/год</w:t>
+            </w:r>
+          </w:p>
+        </w:tc>
+        <w:tc>
+          <w:tcPr>
+            <w:tcW w:type="dxa" w:w="3212"/>
+          </w:tcPr>
+          <w:p>
+            <w:r>
+              <w:t xml:space="preserve">Осторожный сценарий раздела 8 — реалистичный захват в первый год с учётом отсутствия репутации у нового продукта</w:t>
+            </w:r>
+          </w:p>
+        </w:tc>
+      </w:tr>
+    </w:tbl>
+    <w:p>
+      <w:pPr>
+        <w:spacing w:after="120"/>
+      </w:pPr>
+    </w:p>
+    <w:p>
+      <w:pPr>
+        <w:spacing w:after="120"/>
+      </w:pPr>
+      <w:r>
+        <w:t xml:space="preserve">Разрыв TAM/SAM почти в 20 раз — прямое следствие того, что три коэффициента сужения в разделе 5 (2 %, 5 %, 10 %) экспертные и не проверены; такой разрыв методика явно ожидает от grubого top-down-потолка и не считает ошибкой сам по себе, но требует явно об этом написать в отчёте, а не молчать.</w:t>
+      </w:r>
+    </w:p>
+    <w:p>
+      <w:pPr>
+        <w:pStyle w:val="Heading1"/>
+        <w:spacing w:after="120" w:before="240"/>
+      </w:pPr>
+      <w:r>
+        <w:t xml:space="preserve">7. Оценка через цифровую воронку</w:t>
+      </w:r>
+    </w:p>
+    <w:p>
+      <w:pPr>
+        <w:spacing w:after="20"/>
+      </w:pPr>
+      <w:r>
+        <w:rPr>
+          <w:rFonts w:ascii="Consolas" w:cs="Consolas" w:eastAsia="Consolas" w:hAnsi="Consolas"/>
+          <w:sz w:val="20"/>
+          <w:szCs w:val="20"/>
+        </w:rPr>
+        <w:t xml:space="preserve">Выручка = охват (посетители блога/документации DiagramCode + органический поиск по семантическому ядру ЛР1)</w:t>
+      </w:r>
+    </w:p>
+    <w:p>
+      <w:pPr>
+        <w:spacing w:after="20"/>
+      </w:pPr>
+      <w:r>
+        <w:rPr>
+          <w:rFonts w:ascii="Consolas" w:cs="Consolas" w:eastAsia="Consolas" w:hAnsi="Consolas"/>
+          <w:sz w:val="20"/>
+          <w:szCs w:val="20"/>
+        </w:rPr>
+        <w:t xml:space="preserve">        × доля переходов на сайт (допущение 20%)</w:t>
+      </w:r>
+    </w:p>
+    <w:p>
+      <w:pPr>
+        <w:spacing w:after="20"/>
+      </w:pPr>
+      <w:r>
+        <w:rPr>
+          <w:rFonts w:ascii="Consolas" w:cs="Consolas" w:eastAsia="Consolas" w:hAnsi="Consolas"/>
+          <w:sz w:val="20"/>
+          <w:szCs w:val="20"/>
+        </w:rPr>
+        <w:t xml:space="preserve">        × конверсия в регистрацию (допущение 8%, ориентир по индустрии для dev-tools)</w:t>
+      </w:r>
+    </w:p>
+    <w:p>
+      <w:pPr>
+        <w:spacing w:after="20"/>
+      </w:pPr>
+      <w:r>
+        <w:rPr>
+          <w:rFonts w:ascii="Consolas" w:cs="Consolas" w:eastAsia="Consolas" w:hAnsi="Consolas"/>
+          <w:sz w:val="20"/>
+          <w:szCs w:val="20"/>
+        </w:rPr>
+        <w:t xml:space="preserve">        × конверсия в оплату (допущение 5%, консервативно из-за сильных бесплатных альтернатив — PlantUML/Mermaid бесплатны)</w:t>
+      </w:r>
+    </w:p>
+    <w:p>
+      <w:pPr>
+        <w:spacing w:after="20"/>
+      </w:pPr>
+      <w:r>
+        <w:rPr>
+          <w:rFonts w:ascii="Consolas" w:cs="Consolas" w:eastAsia="Consolas" w:hAnsi="Consolas"/>
+          <w:sz w:val="20"/>
+          <w:szCs w:val="20"/>
+        </w:rPr>
+        <w:t xml:space="preserve">        × средний чек $480/год</w:t>
+      </w:r>
+    </w:p>
+    <w:p>
+      <w:pPr>
+        <w:spacing w:after="100"/>
+      </w:pPr>
+    </w:p>
+    <w:p>
+      <w:pPr>
+        <w:spacing w:after="120"/>
+      </w:pPr>
+      <w:r>
+        <w:t xml:space="preserve">Без готового трафика сайта DiagramCode (продукт ещё не запущен) этот расчёт пока не даёт числа — он используется после первого релиза как инструмент проверки факта, а не прогноза (см. общий принцип методики: воронка — расчёт по фактическим данным, а не по гипотетическому трафику).</w:t>
+      </w:r>
+    </w:p>
+    <w:p>
+      <w:pPr>
+        <w:pStyle w:val="Heading1"/>
+        <w:spacing w:after="120" w:before="240"/>
+      </w:pPr>
+      <w:r>
+        <w:t xml:space="preserve">8. Сценарная оценка</w:t>
+      </w:r>
+    </w:p>
+    <w:tbl>
+      <w:tblPr>
+        <w:tblW w:type="dxa" w:w="9638"/>
+        <w:tblBorders>
+          <w:top w:val="single" w:color="auto" w:sz="4"/>
+          <w:left w:val="single" w:color="auto" w:sz="4"/>
+          <w:bottom w:val="single" w:color="auto" w:sz="4"/>
+          <w:right w:val="single" w:color="auto" w:sz="4"/>
+          <w:insideH w:val="single" w:color="auto" w:sz="4"/>
+          <w:insideV w:val="single" w:color="auto" w:sz="4"/>
+        </w:tblBorders>
+      </w:tblPr>
+      <w:tblGrid>
+        <w:gridCol w:w="2409"/>
+        <w:gridCol w:w="2409"/>
+        <w:gridCol w:w="2409"/>
+        <w:gridCol w:w="2409"/>
+      </w:tblGrid>
+      <w:tr>
+        <w:trPr>
+          <w:tblHeader/>
+        </w:trPr>
+        <w:tc>
+          <w:tcPr>
+            <w:tcW w:type="dxa" w:w="2409"/>
+            <w:shd w:fill="D9D9D9" w:val="clear"/>
+          </w:tcPr>
+          <w:p>
+            <w:r>
+              <w:rPr>
+                <w:b/>
+                <w:bCs/>
+              </w:rPr>
               <w:t xml:space="preserve">Сценарий</w:t>
             </w:r>
           </w:p>
         </w:tc>
         <w:tc>
           <w:tcPr>
-            <w:tcW w:type="dxa" w:w="3212"/>
+            <w:tcW w:type="dxa" w:w="2409"/>
             <w:shd w:fill="D9D9D9" w:val="clear"/>
           </w:tcPr>
           <w:p>
@@ -1151,7 +1566,7 @@
         </w:tc>
         <w:tc>
           <w:tcPr>
-            <w:tcW w:type="dxa" w:w="3212"/>
+            <w:tcW w:type="dxa" w:w="2409"/>
             <w:shd w:fill="D9D9D9" w:val="clear"/>
           </w:tcPr>
           <w:p>
@@ -1160,6 +1575,21 @@
                 <w:b/>
                 <w:bCs/>
               </w:rPr>
+              <w:t xml:space="preserve">Расчёт</w:t>
+            </w:r>
+          </w:p>
+        </w:tc>
+        <w:tc>
+          <w:tcPr>
+            <w:tcW w:type="dxa" w:w="2409"/>
+            <w:shd w:fill="D9D9D9" w:val="clear"/>
+          </w:tcPr>
+          <w:p>
+            <w:r>
+              <w:rPr>
+                <w:b/>
+                <w:bCs/>
+              </w:rPr>
               <w:t xml:space="preserve">Годовая выручка (сегмент ПВТ Беларуси, 1-й год)</w:t>
             </w:r>
           </w:p>
@@ -1168,7 +1598,7 @@
       <w:tr>
         <w:tc>
           <w:tcPr>
-            <w:tcW w:type="dxa" w:w="3212"/>
+            <w:tcW w:type="dxa" w:w="2409"/>
           </w:tcPr>
           <w:p>
             <w:r>
@@ -1178,29 +1608,46 @@
         </w:tc>
         <w:tc>
           <w:tcPr>
-            <w:tcW w:type="dxa" w:w="3212"/>
-          </w:tcPr>
-          <w:p>
-            <w:r>
-              <w:t xml:space="preserve">Низкая конверсия (5%), низкая доля нуждающихся (40%), $8/мес</w:t>
-            </w:r>
-          </w:p>
-        </w:tc>
-        <w:tc>
-          <w:tcPr>
-            <w:tcW w:type="dxa" w:w="3212"/>
-          </w:tcPr>
-          <w:p>
-            <w:r>
-              <w:t xml:space="preserve">≈ $15 000</w:t>
-            </w:r>
-          </w:p>
-        </w:tc>
-      </w:tr>
-      <w:tr>
-        <w:tc>
-          <w:tcPr>
-            <w:tcW w:type="dxa" w:w="3212"/>
+            <w:tcW w:type="dxa" w:w="2409"/>
+          </w:tcPr>
+          <w:p>
+            <w:r>
+              <w:t xml:space="preserve">Низкая конверсия (5%), низкая доля нуждающихся (40%), $480/год</w:t>
+            </w:r>
+          </w:p>
+        </w:tc>
+        <w:tc>
+          <w:tcPr>
+            <w:tcW w:type="dxa" w:w="2409"/>
+          </w:tcPr>
+          <w:p>
+            <w:r>
+              <w:t xml:space="preserve">1000 × 0,40 × 0,05 × 480</w:t>
+            </w:r>
+          </w:p>
+        </w:tc>
+        <w:tc>
+          <w:tcPr>
+            <w:tcW w:type="dxa" w:w="2409"/>
+          </w:tcPr>
+          <w:p>
+            <w:r>
+              <w:rPr>
+                <w:b/>
+                <w:bCs/>
+              </w:rPr>
+              <w:t xml:space="preserve">$9 600</w:t>
+            </w:r>
+            <w:r>
+              <w:t xml:space="preserve"> *(исправлено — в предыдущей версии здесь стояло ≈$15 000, что не сходилось с этими же допущениями; арифметическая ошибка найдена при ревизии и исправлена)*</w:t>
+            </w:r>
+          </w:p>
+        </w:tc>
+      </w:tr>
+      <w:tr>
+        <w:tc>
+          <w:tcPr>
+            <w:tcW w:type="dxa" w:w="2409"/>
           </w:tcPr>
           <w:p>
             <w:r>
@@ -1210,29 +1657,39 @@
         </w:tc>
         <w:tc>
           <w:tcPr>
-            <w:tcW w:type="dxa" w:w="3212"/>
-          </w:tcPr>
-          <w:p>
-            <w:r>
-              <w:t xml:space="preserve">Средние значения (см. разделы 5-6)</w:t>
-            </w:r>
-          </w:p>
-        </w:tc>
-        <w:tc>
-          <w:tcPr>
-            <w:tcW w:type="dxa" w:w="3212"/>
-          </w:tcPr>
-          <w:p>
-            <w:r>
-              <w:t xml:space="preserve">≈ $22 000–29 000</w:t>
-            </w:r>
-          </w:p>
-        </w:tc>
-      </w:tr>
-      <w:tr>
-        <w:tc>
-          <w:tcPr>
-            <w:tcW w:type="dxa" w:w="3212"/>
+            <w:tcW w:type="dxa" w:w="2409"/>
+          </w:tcPr>
+          <w:p>
+            <w:r>
+              <w:t xml:space="preserve">Значения раздела 6 (снизу вверх)</w:t>
+            </w:r>
+          </w:p>
+        </w:tc>
+        <w:tc>
+          <w:tcPr>
+            <w:tcW w:type="dxa" w:w="2409"/>
+          </w:tcPr>
+          <w:p>
+            <w:r>
+              <w:t xml:space="preserve">1000 × 0,60 × 0,10 × 480</w:t>
+            </w:r>
+          </w:p>
+        </w:tc>
+        <w:tc>
+          <w:tcPr>
+            <w:tcW w:type="dxa" w:w="2409"/>
+          </w:tcPr>
+          <w:p>
+            <w:r>
+              <w:t xml:space="preserve">≈ $28 800 (округлённо $22 000–29 000, см. раздел 6а SAM)</w:t>
+            </w:r>
+          </w:p>
+        </w:tc>
+      </w:tr>
+      <w:tr>
+        <w:tc>
+          <w:tcPr>
+            <w:tcW w:type="dxa" w:w="2409"/>
           </w:tcPr>
           <w:p>
             <w:r>
@@ -1242,7 +1699,7 @@
         </w:tc>
         <w:tc>
           <w:tcPr>
-            <w:tcW w:type="dxa" w:w="3212"/>
+            <w:tcW w:type="dxa" w:w="2409"/>
           </w:tcPr>
           <w:p>
             <w:r>
@@ -1252,11 +1709,28 @@
         </w:tc>
         <w:tc>
           <w:tcPr>
-            <w:tcW w:type="dxa" w:w="3212"/>
-          </w:tcPr>
-          <w:p>
-            <w:r>
-              <w:t xml:space="preserve">≈ $150 000+</w:t>
+            <w:tcW w:type="dxa" w:w="2409"/>
+          </w:tcPr>
+          <w:p>
+            <w:r>
+              <w:t xml:space="preserve">1000×0,70×0,20×480×5</w:t>
+            </w:r>
+          </w:p>
+        </w:tc>
+        <w:tc>
+          <w:tcPr>
+            <w:tcW w:type="dxa" w:w="2409"/>
+          </w:tcPr>
+          <w:p>
+            <w:r>
+              <w:rPr>
+                <w:b/>
+                <w:bCs/>
+              </w:rPr>
+              <w:t xml:space="preserve">$336 000</w:t>
+            </w:r>
+            <w:r>
+              <w:t xml:space="preserve"> *(исправлено — в предыдущей версии здесь стояло «$150 000+», что более чем вдвое занижало результат тех же самых допущений)*</w:t>
             </w:r>
           </w:p>
         </w:tc>
@@ -1435,17 +1909,27 @@
         <w:spacing w:after="120"/>
       </w:pPr>
       <w:r>
-        <w:t xml:space="preserve">Рынок был определён как русскоязычные IT-компании (стартовая база — зарегистрированные в ПВТ Беларуси, более 1000 компаний), которым нужен DSL-инструмент для диаграмм с AI-генерацией. Поисковый спрос (ЛР1) и данные SimilarWeb по ближайшему прямому аналогу (plantuml.com, Россия — топ-страна трафика) подтверждают наличие цифровой активности в сегменте. Расчёт «сверху вниз» и «снизу вверх» дают согласованный диапазон </w:t>
+        <w:t xml:space="preserve">Рынок был определён как русскоязычные IT-компании (стартовая база — зарегистрированные в ПВТ Беларуси, более 1000 компаний), которым нужен DSL-инструмент для диаграмм с AI-генерацией. Поисковый спрос (ЛР1) и данные SimilarWeb по ближайшему прямому аналогу (plantuml.com, Россия — топ-страна трафика) подтверждают наличие цифровой активности в сегменте. Независимый расчёт «сверху вниз» от ВВП/оборота ИТ-сектора Беларуси даёт потолок рынка (TAM) ≈$479 000/год; расчёт «снизу вверх» через количество потенциальных клиентов даёт обслуживаемый рынок (SAM) ≈$21 600–28 800/год. Такой разрыв ожидаем для top-down-потолка (методика ЛР2, §7.1) и требует, а не отменяет, дальнейшего уточнения коэффициентов сужения. Достижимая в 1-й год доля (SOM, осторожный сценарий) — </w:t>
       </w:r>
       <w:r>
         <w:rPr>
           <w:b/>
           <w:bCs/>
         </w:rPr>
-        <w:t xml:space="preserve">$15 000–29 000/год</w:t>
-      </w:r>
-      <w:r>
-        <w:t xml:space="preserve"> в базовом и осторожном сценарии для стартового сегмента ПВТ Беларуси, с потенциалом кратного роста при расширении на СНГ (оптимистичный сценарий). Расчёт требует дальнейшей проверки через прямой опрос потенциальных клиентов и тестовые продажи после запуска первого релиза.</w:t>
+        <w:t xml:space="preserve">$9 600</w:t>
+      </w:r>
+      <w:r>
+        <w:t xml:space="preserve">, с потенциалом до </w:t>
+      </w:r>
+      <w:r>
+        <w:rPr>
+          <w:b/>
+          <w:bCs/>
+        </w:rPr>
+        <w:t xml:space="preserve">$336 000/год</w:t>
+      </w:r>
+      <w:r>
+        <w:t xml:space="preserve"> при расширении на СНГ (оптимистичный сценарий). Расчёт требует дальнейшей проверки через прямой опрос потенциальных клиентов и тестовые продажи после запуска первого релиза.</w:t>
       </w:r>
     </w:p>
     <w:p>

</xml_diff>